<commit_message>
fix part contract bug generation
</commit_message>
<xml_diff>
--- a/document_templates/Contracts/company/contract_company.docx
+++ b/document_templates/Contracts/company/contract_company.docx
@@ -740,17 +740,18 @@
         <w:spacing w:line="240" w:lineRule="auto"/>
         <w:rPr>
           <w:rFonts w:hint="default" w:ascii="Times New Roman" w:hAnsi="Times New Roman" w:cs="Times New Roman"/>
-          <w:highlight w:val="none"/>
-          <w:shd w:val="clear" w:fill="auto"/>
-        </w:rPr>
-      </w:pPr>
-      <w:r>
-        <w:rPr>
-          <w:rFonts w:hint="default" w:ascii="Times New Roman" w:hAnsi="Times New Roman" w:cs="Times New Roman"/>
-          <w:b/>
-          <w:sz w:val="24"/>
-          <w:szCs w:val="24"/>
-          <w:highlight w:val="none"/>
+          <w:sz w:val="24"/>
+          <w:szCs w:val="24"/>
+          <w:highlight w:val="none"/>
+          <w:shd w:val="clear" w:fill="auto"/>
+        </w:rPr>
+      </w:pPr>
+      <w:r>
+        <w:rPr>
+          <w:rFonts w:hint="default" w:ascii="Times New Roman" w:hAnsi="Times New Roman" w:cs="Times New Roman"/>
+          <w:b/>
+          <w:sz w:val="24"/>
+          <w:szCs w:val="24"/>
           <w:shd w:val="clear" w:fill="auto"/>
           <w:lang w:val="en-US"/>
         </w:rPr>
@@ -762,18 +763,70 @@
           <w:b/>
           <w:sz w:val="24"/>
           <w:szCs w:val="24"/>
-          <w:highlight w:val="none"/>
-          <w:shd w:val="clear" w:fill="auto"/>
-        </w:rPr>
-        <w:t xml:space="preserve">Montant                         </w:t>
-      </w:r>
-      <w:r>
-        <w:rPr>
-          <w:rFonts w:hint="default" w:ascii="Times New Roman" w:hAnsi="Times New Roman" w:cs="Times New Roman"/>
-          <w:b/>
-          <w:sz w:val="24"/>
-          <w:szCs w:val="24"/>
-          <w:highlight w:val="none"/>
+          <w:shd w:val="clear" w:fill="auto"/>
+        </w:rPr>
+        <w:t>Montant</w:t>
+      </w:r>
+      <w:r>
+        <w:rPr>
+          <w:rFonts w:hint="default" w:ascii="Times New Roman" w:hAnsi="Times New Roman" w:cs="Times New Roman"/>
+          <w:b/>
+          <w:sz w:val="24"/>
+          <w:szCs w:val="24"/>
+          <w:shd w:val="clear" w:fill="auto"/>
+          <w:lang w:val="en-US"/>
+        </w:rPr>
+        <w:tab/>
+      </w:r>
+      <w:r>
+        <w:rPr>
+          <w:rFonts w:hint="default" w:ascii="Times New Roman" w:hAnsi="Times New Roman" w:cs="Times New Roman"/>
+          <w:b/>
+          <w:sz w:val="24"/>
+          <w:szCs w:val="24"/>
+          <w:shd w:val="clear" w:fill="auto"/>
+          <w:lang w:val="en-US"/>
+        </w:rPr>
+        <w:tab/>
+      </w:r>
+      <w:r>
+        <w:rPr>
+          <w:rFonts w:hint="default" w:ascii="Times New Roman" w:hAnsi="Times New Roman" w:cs="Times New Roman"/>
+          <w:b/>
+          <w:sz w:val="24"/>
+          <w:szCs w:val="24"/>
+          <w:shd w:val="clear" w:fill="auto"/>
+          <w:lang w:val="en-US"/>
+        </w:rPr>
+        <w:tab/>
+      </w:r>
+      <w:r>
+        <w:rPr>
+          <w:rFonts w:hint="default" w:ascii="Times New Roman" w:hAnsi="Times New Roman" w:cs="Times New Roman"/>
+          <w:b/>
+          <w:sz w:val="24"/>
+          <w:szCs w:val="24"/>
+          <w:shd w:val="clear" w:fill="auto"/>
+          <w:lang w:val="en-US"/>
+        </w:rPr>
+        <w:tab/>
+      </w:r>
+      <w:r>
+        <w:rPr>
+          <w:rFonts w:hint="default" w:ascii="Times New Roman" w:hAnsi="Times New Roman" w:cs="Times New Roman"/>
+          <w:b/>
+          <w:sz w:val="24"/>
+          <w:szCs w:val="24"/>
+          <w:shd w:val="clear" w:fill="auto"/>
+        </w:rPr>
+        <w:t>:</w:t>
+      </w:r>
+      <w:r>
+        <w:rPr>
+          <w:rFonts w:hint="default" w:ascii="Times New Roman" w:hAnsi="Times New Roman" w:cs="Times New Roman"/>
+          <w:b/>
+          <w:sz w:val="24"/>
+          <w:szCs w:val="24"/>
           <w:shd w:val="clear" w:fill="auto"/>
           <w:lang w:val="en-US"/>
         </w:rPr>
@@ -785,46 +838,9 @@
           <w:b/>
           <w:sz w:val="24"/>
           <w:szCs w:val="24"/>
-          <w:highlight w:val="none"/>
-          <w:shd w:val="clear" w:fill="auto"/>
-          <w:lang w:val="en-US"/>
-        </w:rPr>
-        <w:tab/>
-      </w:r>
-      <w:r>
-        <w:rPr>
-          <w:rFonts w:hint="default" w:ascii="Times New Roman" w:hAnsi="Times New Roman" w:cs="Times New Roman"/>
-          <w:b/>
-          <w:sz w:val="24"/>
-          <w:szCs w:val="24"/>
-          <w:highlight w:val="none"/>
-          <w:shd w:val="clear" w:fill="auto"/>
-          <w:lang w:val="en-US"/>
-        </w:rPr>
-        <w:tab/>
-      </w:r>
-      <w:r>
-        <w:rPr>
-          <w:rFonts w:hint="default" w:ascii="Times New Roman" w:hAnsi="Times New Roman" w:cs="Times New Roman"/>
-          <w:b/>
-          <w:sz w:val="24"/>
-          <w:szCs w:val="24"/>
-          <w:highlight w:val="none"/>
-          <w:shd w:val="clear" w:fill="auto"/>
-          <w:lang w:val="en-US"/>
-        </w:rPr>
-        <w:tab/>
-      </w:r>
-      <w:r>
-        <w:rPr>
-          <w:rFonts w:hint="default" w:ascii="Times New Roman" w:hAnsi="Times New Roman" w:cs="Times New Roman"/>
-          <w:b/>
-          <w:sz w:val="24"/>
-          <w:szCs w:val="24"/>
-          <w:highlight w:val="none"/>
-          <w:shd w:val="clear" w:fill="auto"/>
-        </w:rPr>
-        <w:t xml:space="preserve">: ${verbal_trial.amount} F CFA </w:t>
+          <w:shd w:val="clear" w:fill="auto"/>
+        </w:rPr>
+        <w:t xml:space="preserve">${verbal_trial.amount} F CFA </w:t>
       </w:r>
     </w:p>
     <w:p>
@@ -839,17 +855,18 @@
         <w:spacing w:line="240" w:lineRule="auto"/>
         <w:rPr>
           <w:rFonts w:hint="default" w:ascii="Times New Roman" w:hAnsi="Times New Roman" w:cs="Times New Roman"/>
-          <w:highlight w:val="none"/>
-          <w:shd w:val="clear" w:fill="auto"/>
-        </w:rPr>
-      </w:pPr>
-      <w:r>
-        <w:rPr>
-          <w:rFonts w:hint="default" w:ascii="Times New Roman" w:hAnsi="Times New Roman" w:cs="Times New Roman"/>
-          <w:b/>
-          <w:sz w:val="24"/>
-          <w:szCs w:val="24"/>
-          <w:highlight w:val="none"/>
+          <w:sz w:val="24"/>
+          <w:szCs w:val="24"/>
+          <w:highlight w:val="none"/>
+          <w:shd w:val="clear" w:fill="auto"/>
+        </w:rPr>
+      </w:pPr>
+      <w:r>
+        <w:rPr>
+          <w:rFonts w:hint="default" w:ascii="Times New Roman" w:hAnsi="Times New Roman" w:cs="Times New Roman"/>
+          <w:b/>
+          <w:sz w:val="24"/>
+          <w:szCs w:val="24"/>
           <w:shd w:val="clear" w:fill="auto"/>
           <w:lang w:val="en-US"/>
         </w:rPr>
@@ -861,18 +878,81 @@
           <w:b/>
           <w:sz w:val="24"/>
           <w:szCs w:val="24"/>
-          <w:highlight w:val="none"/>
-          <w:shd w:val="clear" w:fill="auto"/>
-        </w:rPr>
-        <w:t xml:space="preserve">Durée                             </w:t>
-      </w:r>
-      <w:r>
-        <w:rPr>
-          <w:rFonts w:hint="default" w:ascii="Times New Roman" w:hAnsi="Times New Roman" w:cs="Times New Roman"/>
-          <w:b/>
-          <w:sz w:val="24"/>
-          <w:szCs w:val="24"/>
-          <w:highlight w:val="none"/>
+          <w:shd w:val="clear" w:fill="auto"/>
+        </w:rPr>
+        <w:t>Durée</w:t>
+      </w:r>
+      <w:r>
+        <w:rPr>
+          <w:rFonts w:hint="default" w:ascii="Times New Roman" w:hAnsi="Times New Roman" w:cs="Times New Roman"/>
+          <w:b/>
+          <w:sz w:val="24"/>
+          <w:szCs w:val="24"/>
+          <w:shd w:val="clear" w:fill="auto"/>
+          <w:lang w:val="en-US"/>
+        </w:rPr>
+        <w:tab/>
+      </w:r>
+      <w:r>
+        <w:rPr>
+          <w:rFonts w:hint="default" w:ascii="Times New Roman" w:hAnsi="Times New Roman" w:cs="Times New Roman"/>
+          <w:b/>
+          <w:sz w:val="24"/>
+          <w:szCs w:val="24"/>
+          <w:shd w:val="clear" w:fill="auto"/>
+          <w:lang w:val="en-US"/>
+        </w:rPr>
+        <w:tab/>
+      </w:r>
+      <w:r>
+        <w:rPr>
+          <w:rFonts w:hint="default" w:ascii="Times New Roman" w:hAnsi="Times New Roman" w:cs="Times New Roman"/>
+          <w:b/>
+          <w:sz w:val="24"/>
+          <w:szCs w:val="24"/>
+          <w:shd w:val="clear" w:fill="auto"/>
+          <w:lang w:val="en-US"/>
+        </w:rPr>
+        <w:tab/>
+      </w:r>
+      <w:r>
+        <w:rPr>
+          <w:rFonts w:hint="default" w:ascii="Times New Roman" w:hAnsi="Times New Roman" w:cs="Times New Roman"/>
+          <w:b/>
+          <w:sz w:val="24"/>
+          <w:szCs w:val="24"/>
+          <w:shd w:val="clear" w:fill="auto"/>
+          <w:lang w:val="en-US"/>
+        </w:rPr>
+        <w:tab/>
+      </w:r>
+      <w:r>
+        <w:rPr>
+          <w:rFonts w:hint="default" w:ascii="Times New Roman" w:hAnsi="Times New Roman" w:cs="Times New Roman"/>
+          <w:b/>
+          <w:sz w:val="24"/>
+          <w:szCs w:val="24"/>
+          <w:shd w:val="clear" w:fill="auto"/>
+          <w:lang w:val="en-US"/>
+        </w:rPr>
+        <w:tab/>
+      </w:r>
+      <w:r>
+        <w:rPr>
+          <w:rFonts w:hint="default" w:ascii="Times New Roman" w:hAnsi="Times New Roman" w:cs="Times New Roman"/>
+          <w:b/>
+          <w:sz w:val="24"/>
+          <w:szCs w:val="24"/>
+          <w:shd w:val="clear" w:fill="auto"/>
+        </w:rPr>
+        <w:t>:</w:t>
+      </w:r>
+      <w:r>
+        <w:rPr>
+          <w:rFonts w:hint="default" w:ascii="Times New Roman" w:hAnsi="Times New Roman" w:cs="Times New Roman"/>
+          <w:b/>
+          <w:sz w:val="24"/>
+          <w:szCs w:val="24"/>
           <w:shd w:val="clear" w:fill="auto"/>
           <w:lang w:val="en-US"/>
         </w:rPr>
@@ -884,46 +964,9 @@
           <w:b/>
           <w:sz w:val="24"/>
           <w:szCs w:val="24"/>
-          <w:highlight w:val="none"/>
-          <w:shd w:val="clear" w:fill="auto"/>
-          <w:lang w:val="en-US"/>
-        </w:rPr>
-        <w:tab/>
-      </w:r>
-      <w:r>
-        <w:rPr>
-          <w:rFonts w:hint="default" w:ascii="Times New Roman" w:hAnsi="Times New Roman" w:cs="Times New Roman"/>
-          <w:b/>
-          <w:sz w:val="24"/>
-          <w:szCs w:val="24"/>
-          <w:highlight w:val="none"/>
-          <w:shd w:val="clear" w:fill="auto"/>
-          <w:lang w:val="en-US"/>
-        </w:rPr>
-        <w:tab/>
-      </w:r>
-      <w:r>
-        <w:rPr>
-          <w:rFonts w:hint="default" w:ascii="Times New Roman" w:hAnsi="Times New Roman" w:cs="Times New Roman"/>
-          <w:b/>
-          <w:sz w:val="24"/>
-          <w:szCs w:val="24"/>
-          <w:highlight w:val="none"/>
-          <w:shd w:val="clear" w:fill="auto"/>
-          <w:lang w:val="en-US"/>
-        </w:rPr>
-        <w:tab/>
-      </w:r>
-      <w:r>
-        <w:rPr>
-          <w:rFonts w:hint="default" w:ascii="Times New Roman" w:hAnsi="Times New Roman" w:cs="Times New Roman"/>
-          <w:b/>
-          <w:sz w:val="24"/>
-          <w:szCs w:val="24"/>
-          <w:highlight w:val="none"/>
-          <w:shd w:val="clear" w:fill="auto"/>
-        </w:rPr>
-        <w:t>:  ${verbal_trial.duration} mois</w:t>
+          <w:shd w:val="clear" w:fill="auto"/>
+        </w:rPr>
+        <w:t>${verbal_trial.duration} mois</w:t>
       </w:r>
     </w:p>
     <w:p>
@@ -938,17 +981,18 @@
         <w:spacing w:line="240" w:lineRule="auto"/>
         <w:rPr>
           <w:rFonts w:hint="default" w:ascii="Times New Roman" w:hAnsi="Times New Roman" w:cs="Times New Roman"/>
-          <w:highlight w:val="none"/>
-          <w:shd w:val="clear" w:fill="auto"/>
-        </w:rPr>
-      </w:pPr>
-      <w:r>
-        <w:rPr>
-          <w:rFonts w:hint="default" w:ascii="Times New Roman" w:hAnsi="Times New Roman" w:cs="Times New Roman"/>
-          <w:b/>
-          <w:sz w:val="24"/>
-          <w:szCs w:val="24"/>
-          <w:highlight w:val="none"/>
+          <w:sz w:val="24"/>
+          <w:szCs w:val="24"/>
+          <w:highlight w:val="none"/>
+          <w:shd w:val="clear" w:fill="auto"/>
+        </w:rPr>
+      </w:pPr>
+      <w:r>
+        <w:rPr>
+          <w:rFonts w:hint="default" w:ascii="Times New Roman" w:hAnsi="Times New Roman" w:cs="Times New Roman"/>
+          <w:b/>
+          <w:sz w:val="24"/>
+          <w:szCs w:val="24"/>
           <w:shd w:val="clear" w:fill="auto"/>
           <w:lang w:val="en-US"/>
         </w:rPr>
@@ -960,18 +1004,70 @@
           <w:b/>
           <w:sz w:val="24"/>
           <w:szCs w:val="24"/>
-          <w:highlight w:val="none"/>
-          <w:shd w:val="clear" w:fill="auto"/>
-        </w:rPr>
-        <w:t xml:space="preserve">Périodicité                     </w:t>
-      </w:r>
-      <w:r>
-        <w:rPr>
-          <w:rFonts w:hint="default" w:ascii="Times New Roman" w:hAnsi="Times New Roman" w:cs="Times New Roman"/>
-          <w:b/>
-          <w:sz w:val="24"/>
-          <w:szCs w:val="24"/>
-          <w:highlight w:val="none"/>
+          <w:shd w:val="clear" w:fill="auto"/>
+        </w:rPr>
+        <w:t>Périodicité</w:t>
+      </w:r>
+      <w:r>
+        <w:rPr>
+          <w:rFonts w:hint="default" w:ascii="Times New Roman" w:hAnsi="Times New Roman" w:cs="Times New Roman"/>
+          <w:b/>
+          <w:sz w:val="24"/>
+          <w:szCs w:val="24"/>
+          <w:shd w:val="clear" w:fill="auto"/>
+          <w:lang w:val="en-US"/>
+        </w:rPr>
+        <w:tab/>
+      </w:r>
+      <w:r>
+        <w:rPr>
+          <w:rFonts w:hint="default" w:ascii="Times New Roman" w:hAnsi="Times New Roman" w:cs="Times New Roman"/>
+          <w:b/>
+          <w:sz w:val="24"/>
+          <w:szCs w:val="24"/>
+          <w:shd w:val="clear" w:fill="auto"/>
+          <w:lang w:val="en-US"/>
+        </w:rPr>
+        <w:tab/>
+      </w:r>
+      <w:r>
+        <w:rPr>
+          <w:rFonts w:hint="default" w:ascii="Times New Roman" w:hAnsi="Times New Roman" w:cs="Times New Roman"/>
+          <w:b/>
+          <w:sz w:val="24"/>
+          <w:szCs w:val="24"/>
+          <w:shd w:val="clear" w:fill="auto"/>
+          <w:lang w:val="en-US"/>
+        </w:rPr>
+        <w:tab/>
+      </w:r>
+      <w:r>
+        <w:rPr>
+          <w:rFonts w:hint="default" w:ascii="Times New Roman" w:hAnsi="Times New Roman" w:cs="Times New Roman"/>
+          <w:b/>
+          <w:sz w:val="24"/>
+          <w:szCs w:val="24"/>
+          <w:shd w:val="clear" w:fill="auto"/>
+          <w:lang w:val="en-US"/>
+        </w:rPr>
+        <w:tab/>
+      </w:r>
+      <w:r>
+        <w:rPr>
+          <w:rFonts w:hint="default" w:ascii="Times New Roman" w:hAnsi="Times New Roman" w:cs="Times New Roman"/>
+          <w:b/>
+          <w:sz w:val="24"/>
+          <w:szCs w:val="24"/>
+          <w:shd w:val="clear" w:fill="auto"/>
+        </w:rPr>
+        <w:t>:</w:t>
+      </w:r>
+      <w:r>
+        <w:rPr>
+          <w:rFonts w:hint="default" w:ascii="Times New Roman" w:hAnsi="Times New Roman" w:cs="Times New Roman"/>
+          <w:b/>
+          <w:sz w:val="24"/>
+          <w:szCs w:val="24"/>
           <w:shd w:val="clear" w:fill="auto"/>
           <w:lang w:val="en-US"/>
         </w:rPr>
@@ -983,46 +1079,9 @@
           <w:b/>
           <w:sz w:val="24"/>
           <w:szCs w:val="24"/>
-          <w:highlight w:val="none"/>
-          <w:shd w:val="clear" w:fill="auto"/>
-          <w:lang w:val="en-US"/>
-        </w:rPr>
-        <w:tab/>
-      </w:r>
-      <w:r>
-        <w:rPr>
-          <w:rFonts w:hint="default" w:ascii="Times New Roman" w:hAnsi="Times New Roman" w:cs="Times New Roman"/>
-          <w:b/>
-          <w:sz w:val="24"/>
-          <w:szCs w:val="24"/>
-          <w:highlight w:val="none"/>
-          <w:shd w:val="clear" w:fill="auto"/>
-          <w:lang w:val="en-US"/>
-        </w:rPr>
-        <w:tab/>
-      </w:r>
-      <w:r>
-        <w:rPr>
-          <w:rFonts w:hint="default" w:ascii="Times New Roman" w:hAnsi="Times New Roman" w:cs="Times New Roman"/>
-          <w:b/>
-          <w:sz w:val="24"/>
-          <w:szCs w:val="24"/>
-          <w:highlight w:val="none"/>
-          <w:shd w:val="clear" w:fill="auto"/>
-          <w:lang w:val="en-US"/>
-        </w:rPr>
-        <w:tab/>
-      </w:r>
-      <w:r>
-        <w:rPr>
-          <w:rFonts w:hint="default" w:ascii="Times New Roman" w:hAnsi="Times New Roman" w:cs="Times New Roman"/>
-          <w:b/>
-          <w:sz w:val="24"/>
-          <w:szCs w:val="24"/>
-          <w:highlight w:val="none"/>
-          <w:shd w:val="clear" w:fill="auto"/>
-        </w:rPr>
-        <w:t xml:space="preserve">: ${verbal_trial.periodicity.fr}  </w:t>
+          <w:shd w:val="clear" w:fill="auto"/>
+        </w:rPr>
+        <w:t xml:space="preserve">${verbal_trial.periodicity.fr}  </w:t>
       </w:r>
     </w:p>
     <w:p>
@@ -1037,17 +1096,18 @@
         <w:spacing w:line="240" w:lineRule="auto"/>
         <w:rPr>
           <w:rFonts w:hint="default" w:ascii="Times New Roman" w:hAnsi="Times New Roman" w:cs="Times New Roman"/>
-          <w:highlight w:val="none"/>
-          <w:shd w:val="clear" w:fill="auto"/>
-        </w:rPr>
-      </w:pPr>
-      <w:r>
-        <w:rPr>
-          <w:rFonts w:hint="default" w:ascii="Times New Roman" w:hAnsi="Times New Roman" w:cs="Times New Roman"/>
-          <w:b/>
-          <w:sz w:val="24"/>
-          <w:szCs w:val="24"/>
-          <w:highlight w:val="none"/>
+          <w:sz w:val="24"/>
+          <w:szCs w:val="24"/>
+          <w:highlight w:val="none"/>
+          <w:shd w:val="clear" w:fill="auto"/>
+        </w:rPr>
+      </w:pPr>
+      <w:r>
+        <w:rPr>
+          <w:rFonts w:hint="default" w:ascii="Times New Roman" w:hAnsi="Times New Roman" w:cs="Times New Roman"/>
+          <w:b/>
+          <w:sz w:val="24"/>
+          <w:szCs w:val="24"/>
           <w:shd w:val="clear" w:fill="auto"/>
           <w:lang w:val="en-US"/>
         </w:rPr>
@@ -1059,41 +1119,16 @@
           <w:b/>
           <w:sz w:val="24"/>
           <w:szCs w:val="24"/>
-          <w:highlight w:val="none"/>
-          <w:shd w:val="clear" w:fill="auto"/>
-        </w:rPr>
-        <w:t xml:space="preserve">Taux  </w:t>
-      </w:r>
-      <w:r>
-        <w:rPr>
-          <w:rFonts w:hint="default" w:ascii="Times New Roman" w:hAnsi="Times New Roman" w:cs="Times New Roman"/>
-          <w:b/>
-          <w:sz w:val="24"/>
-          <w:szCs w:val="24"/>
-          <w:highlight w:val="none"/>
-          <w:shd w:val="clear" w:fill="auto"/>
-          <w:lang w:val="en-US"/>
-        </w:rPr>
-        <w:t xml:space="preserve">  </w:t>
-      </w:r>
-      <w:r>
-        <w:rPr>
-          <w:rFonts w:hint="default" w:ascii="Times New Roman" w:hAnsi="Times New Roman" w:cs="Times New Roman"/>
-          <w:b/>
-          <w:sz w:val="24"/>
-          <w:szCs w:val="24"/>
-          <w:highlight w:val="none"/>
-          <w:shd w:val="clear" w:fill="auto"/>
-        </w:rPr>
-        <w:t xml:space="preserve">                            </w:t>
-      </w:r>
-      <w:r>
-        <w:rPr>
-          <w:rFonts w:hint="default" w:ascii="Times New Roman" w:hAnsi="Times New Roman" w:cs="Times New Roman"/>
-          <w:b/>
-          <w:sz w:val="24"/>
-          <w:szCs w:val="24"/>
-          <w:highlight w:val="none"/>
+          <w:shd w:val="clear" w:fill="auto"/>
+        </w:rPr>
+        <w:t>Taux</w:t>
+      </w:r>
+      <w:r>
+        <w:rPr>
+          <w:rFonts w:hint="default" w:ascii="Times New Roman" w:hAnsi="Times New Roman" w:cs="Times New Roman"/>
+          <w:b/>
+          <w:sz w:val="24"/>
+          <w:szCs w:val="24"/>
           <w:shd w:val="clear" w:fill="auto"/>
           <w:lang w:val="en-US"/>
         </w:rPr>
@@ -1105,7 +1140,6 @@
           <w:b/>
           <w:sz w:val="24"/>
           <w:szCs w:val="24"/>
-          <w:highlight w:val="none"/>
           <w:shd w:val="clear" w:fill="auto"/>
           <w:lang w:val="en-US"/>
         </w:rPr>
@@ -1117,7 +1151,6 @@
           <w:b/>
           <w:sz w:val="24"/>
           <w:szCs w:val="24"/>
-          <w:highlight w:val="none"/>
           <w:shd w:val="clear" w:fill="auto"/>
           <w:lang w:val="en-US"/>
         </w:rPr>
@@ -1129,36 +1162,6 @@
           <w:b/>
           <w:sz w:val="24"/>
           <w:szCs w:val="24"/>
-          <w:highlight w:val="none"/>
-          <w:shd w:val="clear" w:fill="auto"/>
-        </w:rPr>
-        <w:t>: ${ht_rate} %</w:t>
-      </w:r>
-    </w:p>
-    <w:p>
-      <w:pPr>
-        <w:tabs>
-          <w:tab w:val="left" w:pos="708"/>
-          <w:tab w:val="left" w:pos="1416"/>
-          <w:tab w:val="left" w:pos="2124"/>
-          <w:tab w:val="left" w:pos="2748"/>
-          <w:tab w:val="left" w:pos="3708"/>
-          <w:tab w:val="center" w:pos="4896"/>
-        </w:tabs>
-        <w:spacing w:line="240" w:lineRule="auto"/>
-        <w:rPr>
-          <w:rFonts w:hint="default" w:ascii="Times New Roman" w:hAnsi="Times New Roman" w:cs="Times New Roman"/>
-          <w:highlight w:val="none"/>
-          <w:shd w:val="clear" w:fill="auto"/>
-        </w:rPr>
-      </w:pPr>
-      <w:r>
-        <w:rPr>
-          <w:rFonts w:hint="default" w:ascii="Times New Roman" w:hAnsi="Times New Roman" w:cs="Times New Roman"/>
-          <w:b/>
-          <w:sz w:val="24"/>
-          <w:szCs w:val="24"/>
-          <w:highlight w:val="none"/>
           <w:shd w:val="clear" w:fill="auto"/>
           <w:lang w:val="en-US"/>
         </w:rPr>
@@ -1170,18 +1173,27 @@
           <w:b/>
           <w:sz w:val="24"/>
           <w:szCs w:val="24"/>
-          <w:highlight w:val="none"/>
-          <w:shd w:val="clear" w:fill="auto"/>
-        </w:rPr>
-        <w:t xml:space="preserve">TAF                              </w:t>
-      </w:r>
-      <w:r>
-        <w:rPr>
-          <w:rFonts w:hint="default" w:ascii="Times New Roman" w:hAnsi="Times New Roman" w:cs="Times New Roman"/>
-          <w:b/>
-          <w:sz w:val="24"/>
-          <w:szCs w:val="24"/>
-          <w:highlight w:val="none"/>
+          <w:shd w:val="clear" w:fill="auto"/>
+          <w:lang w:val="en-US"/>
+        </w:rPr>
+        <w:tab/>
+      </w:r>
+      <w:r>
+        <w:rPr>
+          <w:rFonts w:hint="default" w:ascii="Times New Roman" w:hAnsi="Times New Roman" w:cs="Times New Roman"/>
+          <w:b/>
+          <w:sz w:val="24"/>
+          <w:szCs w:val="24"/>
+          <w:shd w:val="clear" w:fill="auto"/>
+        </w:rPr>
+        <w:t>:</w:t>
+      </w:r>
+      <w:r>
+        <w:rPr>
+          <w:rFonts w:hint="default" w:ascii="Times New Roman" w:hAnsi="Times New Roman" w:cs="Times New Roman"/>
+          <w:b/>
+          <w:sz w:val="24"/>
+          <w:szCs w:val="24"/>
           <w:shd w:val="clear" w:fill="auto"/>
           <w:lang w:val="en-US"/>
         </w:rPr>
@@ -1193,57 +1205,9 @@
           <w:b/>
           <w:sz w:val="24"/>
           <w:szCs w:val="24"/>
-          <w:highlight w:val="none"/>
-          <w:shd w:val="clear" w:fill="auto"/>
-        </w:rPr>
-        <w:t xml:space="preserve">  </w:t>
-      </w:r>
-      <w:r>
-        <w:rPr>
-          <w:rFonts w:hint="default" w:ascii="Times New Roman" w:hAnsi="Times New Roman" w:cs="Times New Roman"/>
-          <w:b/>
-          <w:sz w:val="24"/>
-          <w:szCs w:val="24"/>
-          <w:highlight w:val="none"/>
-          <w:shd w:val="clear" w:fill="auto"/>
-          <w:lang w:val="en-US"/>
-        </w:rPr>
-        <w:tab/>
-      </w:r>
-      <w:r>
-        <w:rPr>
-          <w:rFonts w:hint="default" w:ascii="Times New Roman" w:hAnsi="Times New Roman" w:cs="Times New Roman"/>
-          <w:b/>
-          <w:sz w:val="24"/>
-          <w:szCs w:val="24"/>
-          <w:highlight w:val="none"/>
-          <w:shd w:val="clear" w:fill="auto"/>
-          <w:lang w:val="en-US"/>
-        </w:rPr>
-        <w:tab/>
-      </w:r>
-      <w:r>
-        <w:rPr>
-          <w:rFonts w:hint="default" w:ascii="Times New Roman" w:hAnsi="Times New Roman" w:cs="Times New Roman"/>
-          <w:b/>
-          <w:sz w:val="24"/>
-          <w:szCs w:val="24"/>
-          <w:highlight w:val="none"/>
-          <w:shd w:val="clear" w:fill="auto"/>
-          <w:lang w:val="en-US"/>
-        </w:rPr>
-        <w:tab/>
-      </w:r>
-      <w:r>
-        <w:rPr>
-          <w:rFonts w:hint="default" w:ascii="Times New Roman" w:hAnsi="Times New Roman" w:cs="Times New Roman"/>
-          <w:b/>
-          <w:sz w:val="24"/>
-          <w:szCs w:val="24"/>
-          <w:highlight w:val="none"/>
-          <w:shd w:val="clear" w:fill="auto"/>
-        </w:rPr>
-        <w:t>: ${verbal_trial.taf} %</w:t>
+          <w:shd w:val="clear" w:fill="auto"/>
+        </w:rPr>
+        <w:t>${ht_rate} %</w:t>
       </w:r>
     </w:p>
     <w:p>
@@ -1258,17 +1222,19 @@
         <w:spacing w:line="240" w:lineRule="auto"/>
         <w:rPr>
           <w:rFonts w:hint="default" w:ascii="Times New Roman" w:hAnsi="Times New Roman" w:cs="Times New Roman"/>
-          <w:highlight w:val="none"/>
-          <w:shd w:val="clear" w:fill="auto"/>
-        </w:rPr>
-      </w:pPr>
-      <w:r>
-        <w:rPr>
-          <w:rFonts w:hint="default" w:ascii="Times New Roman" w:hAnsi="Times New Roman" w:cs="Times New Roman"/>
-          <w:b/>
-          <w:sz w:val="24"/>
-          <w:szCs w:val="24"/>
-          <w:highlight w:val="none"/>
+          <w:b/>
+          <w:sz w:val="24"/>
+          <w:szCs w:val="24"/>
+          <w:shd w:val="clear" w:fill="auto"/>
+          <w:lang w:val="en-US"/>
+        </w:rPr>
+      </w:pPr>
+      <w:r>
+        <w:rPr>
+          <w:rFonts w:hint="default" w:ascii="Times New Roman" w:hAnsi="Times New Roman" w:cs="Times New Roman"/>
+          <w:b/>
+          <w:sz w:val="24"/>
+          <w:szCs w:val="24"/>
           <w:shd w:val="clear" w:fill="auto"/>
           <w:lang w:val="en-US"/>
         </w:rPr>
@@ -1280,18 +1246,27 @@
           <w:b/>
           <w:sz w:val="24"/>
           <w:szCs w:val="24"/>
-          <w:highlight w:val="none"/>
-          <w:shd w:val="clear" w:fill="auto"/>
-        </w:rPr>
-        <w:t xml:space="preserve">Frais de dossier              </w:t>
-      </w:r>
-      <w:r>
-        <w:rPr>
-          <w:rFonts w:hint="default" w:ascii="Times New Roman" w:hAnsi="Times New Roman" w:cs="Times New Roman"/>
-          <w:b/>
-          <w:sz w:val="24"/>
-          <w:szCs w:val="24"/>
-          <w:highlight w:val="none"/>
+          <w:shd w:val="clear" w:fill="auto"/>
+        </w:rPr>
+        <w:t>T</w:t>
+      </w:r>
+      <w:r>
+        <w:rPr>
+          <w:rFonts w:hint="default" w:ascii="Times New Roman" w:hAnsi="Times New Roman" w:cs="Times New Roman"/>
+          <w:b/>
+          <w:sz w:val="24"/>
+          <w:szCs w:val="24"/>
+          <w:shd w:val="clear" w:fill="auto"/>
+          <w:lang w:val="en-US"/>
+        </w:rPr>
+        <w:t>AF</w:t>
+      </w:r>
+      <w:r>
+        <w:rPr>
+          <w:rFonts w:hint="default" w:ascii="Times New Roman" w:hAnsi="Times New Roman" w:cs="Times New Roman"/>
+          <w:b/>
+          <w:sz w:val="24"/>
+          <w:szCs w:val="24"/>
           <w:shd w:val="clear" w:fill="auto"/>
           <w:lang w:val="en-US"/>
         </w:rPr>
@@ -1303,7 +1278,6 @@
           <w:b/>
           <w:sz w:val="24"/>
           <w:szCs w:val="24"/>
-          <w:highlight w:val="none"/>
           <w:shd w:val="clear" w:fill="auto"/>
           <w:lang w:val="en-US"/>
         </w:rPr>
@@ -1315,7 +1289,6 @@
           <w:b/>
           <w:sz w:val="24"/>
           <w:szCs w:val="24"/>
-          <w:highlight w:val="none"/>
           <w:shd w:val="clear" w:fill="auto"/>
           <w:lang w:val="en-US"/>
         </w:rPr>
@@ -1327,22 +1300,52 @@
           <w:b/>
           <w:sz w:val="24"/>
           <w:szCs w:val="24"/>
-          <w:highlight w:val="none"/>
-          <w:shd w:val="clear" w:fill="auto"/>
-        </w:rPr>
-        <w:t xml:space="preserve">: ${verbal_trial.administrative_fees_percentage}  </w:t>
-      </w:r>
-      <w:r>
-        <w:rPr>
-          <w:rFonts w:hint="default" w:ascii="Times New Roman" w:hAnsi="Times New Roman" w:cs="Times New Roman"/>
-          <w:b/>
-          <w:sz w:val="24"/>
-          <w:szCs w:val="24"/>
-          <w:highlight w:val="none"/>
-          <w:shd w:val="clear" w:fill="auto"/>
-          <w:lang w:val="en-US"/>
-        </w:rPr>
-        <w:t>%</w:t>
+          <w:shd w:val="clear" w:fill="auto"/>
+          <w:lang w:val="en-US"/>
+        </w:rPr>
+        <w:tab/>
+      </w:r>
+      <w:r>
+        <w:rPr>
+          <w:rFonts w:hint="default" w:ascii="Times New Roman" w:hAnsi="Times New Roman" w:cs="Times New Roman"/>
+          <w:b/>
+          <w:sz w:val="24"/>
+          <w:szCs w:val="24"/>
+          <w:shd w:val="clear" w:fill="auto"/>
+          <w:lang w:val="en-US"/>
+        </w:rPr>
+        <w:tab/>
+      </w:r>
+      <w:r>
+        <w:rPr>
+          <w:rFonts w:hint="default" w:ascii="Times New Roman" w:hAnsi="Times New Roman" w:cs="Times New Roman"/>
+          <w:b/>
+          <w:sz w:val="24"/>
+          <w:szCs w:val="24"/>
+          <w:shd w:val="clear" w:fill="auto"/>
+        </w:rPr>
+        <w:t>:</w:t>
+      </w:r>
+      <w:r>
+        <w:rPr>
+          <w:rFonts w:hint="default" w:ascii="Times New Roman" w:hAnsi="Times New Roman" w:cs="Times New Roman"/>
+          <w:b/>
+          <w:sz w:val="24"/>
+          <w:szCs w:val="24"/>
+          <w:shd w:val="clear" w:fill="auto"/>
+          <w:lang w:val="en-US"/>
+        </w:rPr>
+        <w:t xml:space="preserve"> </w:t>
+      </w:r>
+      <w:r>
+        <w:rPr>
+          <w:rFonts w:hint="default" w:ascii="Times New Roman" w:hAnsi="Times New Roman" w:cs="Times New Roman"/>
+          <w:b/>
+          <w:sz w:val="24"/>
+          <w:szCs w:val="24"/>
+          <w:shd w:val="clear" w:fill="auto"/>
+        </w:rPr>
+        <w:t>${verbal_trial.taf} %</w:t>
       </w:r>
     </w:p>
     <w:p>
@@ -1367,7 +1370,9 @@
         <w:rPr>
           <w:rFonts w:hint="default" w:ascii="Times New Roman" w:hAnsi="Times New Roman" w:cs="Times New Roman"/>
           <w:b/>
-          <w:highlight w:val="none"/>
+          <w:sz w:val="24"/>
+          <w:szCs w:val="24"/>
+          <w:shd w:val="clear" w:fill="auto"/>
           <w:lang w:val="en-US"/>
         </w:rPr>
         <w:tab/>
@@ -1378,15 +1383,17 @@
           <w:b/>
           <w:sz w:val="24"/>
           <w:szCs w:val="24"/>
-        </w:rPr>
-        <w:t>Prime d’assurance</w:t>
-      </w:r>
-      <w:r>
-        <w:rPr>
-          <w:rFonts w:hint="default" w:ascii="Times New Roman" w:hAnsi="Times New Roman" w:cs="Times New Roman"/>
-          <w:b/>
-          <w:sz w:val="24"/>
-          <w:szCs w:val="24"/>
+          <w:shd w:val="clear" w:fill="auto"/>
+        </w:rPr>
+        <w:t>Frais de dossier</w:t>
+      </w:r>
+      <w:r>
+        <w:rPr>
+          <w:rFonts w:hint="default" w:ascii="Times New Roman" w:hAnsi="Times New Roman" w:cs="Times New Roman"/>
+          <w:b/>
+          <w:sz w:val="24"/>
+          <w:szCs w:val="24"/>
+          <w:shd w:val="clear" w:fill="auto"/>
           <w:lang w:val="en-US"/>
         </w:rPr>
         <w:tab/>
@@ -1397,16 +1404,7 @@
           <w:b/>
           <w:sz w:val="24"/>
           <w:szCs w:val="24"/>
-          <w:lang w:val="en-US"/>
-        </w:rPr>
-        <w:t xml:space="preserve">       </w:t>
-      </w:r>
-      <w:r>
-        <w:rPr>
-          <w:rFonts w:hint="default" w:ascii="Times New Roman" w:hAnsi="Times New Roman" w:cs="Times New Roman"/>
-          <w:b/>
-          <w:sz w:val="24"/>
-          <w:szCs w:val="24"/>
+          <w:shd w:val="clear" w:fill="auto"/>
           <w:lang w:val="en-US"/>
         </w:rPr>
         <w:tab/>
@@ -1417,6 +1415,7 @@
           <w:b/>
           <w:sz w:val="24"/>
           <w:szCs w:val="24"/>
+          <w:shd w:val="clear" w:fill="auto"/>
           <w:lang w:val="en-US"/>
         </w:rPr>
         <w:tab/>
@@ -1427,37 +1426,43 @@
           <w:b/>
           <w:sz w:val="24"/>
           <w:szCs w:val="24"/>
-          <w:lang w:val="en-US"/>
-        </w:rPr>
-        <w:tab/>
-      </w:r>
-      <w:r>
-        <w:rPr>
-          <w:rFonts w:hint="default" w:ascii="Times New Roman" w:hAnsi="Times New Roman" w:cs="Times New Roman"/>
-          <w:b/>
-          <w:sz w:val="24"/>
-          <w:szCs w:val="24"/>
-        </w:rPr>
-        <w:t xml:space="preserve">: </w:t>
-      </w:r>
-      <w:r>
-        <w:rPr>
-          <w:rFonts w:hint="default" w:ascii="Times New Roman" w:hAnsi="Times New Roman" w:cs="Times New Roman"/>
-          <w:b/>
-          <w:sz w:val="24"/>
-          <w:szCs w:val="24"/>
-          <w:lang w:val="en-US"/>
-        </w:rPr>
-        <w:t>S</w:t>
-      </w:r>
-      <w:r>
-        <w:rPr>
-          <w:rFonts w:hint="default" w:ascii="Times New Roman" w:hAnsi="Times New Roman" w:cs="Times New Roman"/>
-          <w:b/>
-          <w:sz w:val="24"/>
-          <w:szCs w:val="24"/>
-        </w:rPr>
-        <w:t>elon la grille de l’assureur</w:t>
+          <w:shd w:val="clear" w:fill="auto"/>
+        </w:rPr>
+        <w:t>:</w:t>
+      </w:r>
+      <w:r>
+        <w:rPr>
+          <w:rFonts w:hint="default" w:ascii="Times New Roman" w:hAnsi="Times New Roman" w:cs="Times New Roman"/>
+          <w:b/>
+          <w:sz w:val="24"/>
+          <w:szCs w:val="24"/>
+          <w:shd w:val="clear" w:fill="auto"/>
+          <w:lang w:val="en-US"/>
+        </w:rPr>
+        <w:t xml:space="preserve"> </w:t>
+      </w:r>
+      <w:bookmarkStart w:id="10" w:name="_GoBack"/>
+      <w:bookmarkEnd w:id="10"/>
+      <w:r>
+        <w:rPr>
+          <w:rFonts w:hint="default" w:ascii="Times New Roman" w:hAnsi="Times New Roman" w:cs="Times New Roman"/>
+          <w:b/>
+          <w:sz w:val="24"/>
+          <w:szCs w:val="24"/>
+          <w:shd w:val="clear" w:fill="auto"/>
+        </w:rPr>
+        <w:t>${verbal_trial.administrative_fees_percentage}</w:t>
+      </w:r>
+      <w:r>
+        <w:rPr>
+          <w:rFonts w:hint="default" w:ascii="Times New Roman" w:hAnsi="Times New Roman" w:cs="Times New Roman"/>
+          <w:b/>
+          <w:sz w:val="24"/>
+          <w:szCs w:val="24"/>
+          <w:shd w:val="clear" w:fill="auto"/>
+          <w:lang w:val="en-US"/>
+        </w:rPr>
+        <w:t xml:space="preserve"> %</w:t>
       </w:r>
     </w:p>
     <w:p>
@@ -1470,35 +1475,21 @@
           <w:tab w:val="left" w:pos="3708"/>
         </w:tabs>
         <w:spacing w:line="240" w:lineRule="auto"/>
-        <w:ind w:left="720"/>
-        <w:rPr>
-          <w:rFonts w:hint="default" w:ascii="Times New Roman" w:hAnsi="Times New Roman" w:cs="Times New Roman"/>
-          <w:color w:val="111111"/>
-          <w:highlight w:val="none"/>
-          <w:shd w:val="clear" w:fill="auto"/>
-        </w:rPr>
-      </w:pPr>
-      <w:r>
-        <w:rPr>
-          <w:rFonts w:hint="default" w:ascii="Times New Roman" w:hAnsi="Times New Roman" w:cs="Times New Roman"/>
-          <w:b/>
-          <w:color w:val="111111"/>
-          <w:sz w:val="24"/>
-          <w:szCs w:val="24"/>
-          <w:highlight w:val="none"/>
-          <w:shd w:val="clear" w:fill="auto"/>
-        </w:rPr>
-        <w:t xml:space="preserve">Date de la première échéance </w:t>
-      </w:r>
-      <w:r>
-        <w:rPr>
-          <w:rFonts w:hint="default" w:ascii="Times New Roman" w:hAnsi="Times New Roman" w:cs="Times New Roman"/>
-          <w:b/>
-          <w:color w:val="111111"/>
-          <w:sz w:val="24"/>
-          <w:szCs w:val="24"/>
-          <w:highlight w:val="none"/>
-          <w:shd w:val="clear" w:fill="auto"/>
+        <w:jc w:val="both"/>
+        <w:rPr>
+          <w:rFonts w:hint="default" w:ascii="Times New Roman" w:hAnsi="Times New Roman" w:cs="Times New Roman"/>
+          <w:b/>
+          <w:sz w:val="24"/>
+          <w:szCs w:val="24"/>
+          <w:highlight w:val="none"/>
+        </w:rPr>
+      </w:pPr>
+      <w:r>
+        <w:rPr>
+          <w:rFonts w:hint="default" w:ascii="Times New Roman" w:hAnsi="Times New Roman" w:cs="Times New Roman"/>
+          <w:b/>
+          <w:sz w:val="24"/>
+          <w:szCs w:val="24"/>
           <w:lang w:val="en-US"/>
         </w:rPr>
         <w:tab/>
@@ -1507,10 +1498,17 @@
         <w:rPr>
           <w:rFonts w:hint="default" w:ascii="Times New Roman" w:hAnsi="Times New Roman" w:cs="Times New Roman"/>
           <w:b/>
-          <w:color w:val="111111"/>
-          <w:sz w:val="24"/>
-          <w:szCs w:val="24"/>
-          <w:highlight w:val="none"/>
+          <w:sz w:val="24"/>
+          <w:szCs w:val="24"/>
+        </w:rPr>
+        <w:t>Prime d’assurance</w:t>
+      </w:r>
+      <w:r>
+        <w:rPr>
+          <w:rFonts w:hint="default" w:ascii="Times New Roman" w:hAnsi="Times New Roman" w:cs="Times New Roman"/>
+          <w:b/>
+          <w:sz w:val="24"/>
+          <w:szCs w:val="24"/>
           <w:shd w:val="clear" w:fill="auto"/>
           <w:lang w:val="en-US"/>
         </w:rPr>
@@ -1520,13 +1518,72 @@
         <w:rPr>
           <w:rFonts w:hint="default" w:ascii="Times New Roman" w:hAnsi="Times New Roman" w:cs="Times New Roman"/>
           <w:b/>
-          <w:color w:val="111111"/>
-          <w:sz w:val="24"/>
-          <w:szCs w:val="24"/>
-          <w:highlight w:val="none"/>
-          <w:shd w:val="clear" w:fill="auto"/>
-        </w:rPr>
-        <w:t>:</w:t>
+          <w:sz w:val="24"/>
+          <w:szCs w:val="24"/>
+          <w:shd w:val="clear" w:fill="auto"/>
+          <w:lang w:val="en-US"/>
+        </w:rPr>
+        <w:tab/>
+      </w:r>
+      <w:r>
+        <w:rPr>
+          <w:rFonts w:hint="default" w:ascii="Times New Roman" w:hAnsi="Times New Roman" w:cs="Times New Roman"/>
+          <w:b/>
+          <w:sz w:val="24"/>
+          <w:szCs w:val="24"/>
+          <w:shd w:val="clear" w:fill="auto"/>
+          <w:lang w:val="en-US"/>
+        </w:rPr>
+        <w:tab/>
+      </w:r>
+      <w:r>
+        <w:rPr>
+          <w:rFonts w:hint="default" w:ascii="Times New Roman" w:hAnsi="Times New Roman" w:cs="Times New Roman"/>
+          <w:b/>
+          <w:sz w:val="24"/>
+          <w:szCs w:val="24"/>
+        </w:rPr>
+        <w:t xml:space="preserve">: </w:t>
+      </w:r>
+      <w:r>
+        <w:rPr>
+          <w:rFonts w:hint="default" w:ascii="Times New Roman" w:hAnsi="Times New Roman" w:cs="Times New Roman"/>
+          <w:b/>
+          <w:sz w:val="24"/>
+          <w:szCs w:val="24"/>
+          <w:lang w:val="en-US"/>
+        </w:rPr>
+        <w:t>S</w:t>
+      </w:r>
+      <w:r>
+        <w:rPr>
+          <w:rFonts w:hint="default" w:ascii="Times New Roman" w:hAnsi="Times New Roman" w:cs="Times New Roman"/>
+          <w:b/>
+          <w:sz w:val="24"/>
+          <w:szCs w:val="24"/>
+        </w:rPr>
+        <w:t>elon la grille de l’assureur</w:t>
+      </w:r>
+      <w:r>
+        <w:rPr>
+          <w:rFonts w:hint="default" w:ascii="Times New Roman" w:hAnsi="Times New Roman" w:cs="Times New Roman"/>
+          <w:b/>
+          <w:sz w:val="24"/>
+          <w:szCs w:val="24"/>
+          <w:lang w:val="en-US"/>
+        </w:rPr>
+        <w:t>${line_risk_premium_percentage}</w:t>
+      </w:r>
+      <w:r>
+        <w:rPr>
+          <w:rFonts w:hint="default" w:ascii="Times New Roman" w:hAnsi="Times New Roman" w:cs="Times New Roman"/>
+          <w:b/>
+          <w:sz w:val="24"/>
+          <w:szCs w:val="24"/>
+          <w:shd w:val="clear" w:fill="auto"/>
+          <w:lang w:val="en-US"/>
+        </w:rPr>
+        <w:t>${line_review_bonus}</w:t>
       </w:r>
     </w:p>
     <w:p>
@@ -1539,27 +1596,24 @@
           <w:tab w:val="left" w:pos="3708"/>
         </w:tabs>
         <w:spacing w:line="240" w:lineRule="auto"/>
-        <w:ind w:left="720"/>
-        <w:rPr>
-          <w:rFonts w:hint="default" w:ascii="Times New Roman" w:hAnsi="Times New Roman" w:cs="Times New Roman"/>
-          <w:b/>
-          <w:color w:val="FF0000"/>
-          <w:sz w:val="24"/>
-          <w:szCs w:val="24"/>
-          <w:highlight w:val="none"/>
-        </w:rPr>
-      </w:pPr>
-      <w:r>
-        <w:rPr>
-          <w:rFonts w:hint="default" w:ascii="Times New Roman" w:hAnsi="Times New Roman" w:cs="Times New Roman"/>
-          <w:b/>
+        <w:rPr>
+          <w:rFonts w:hint="default" w:ascii="Times New Roman" w:hAnsi="Times New Roman" w:cs="Times New Roman"/>
           <w:color w:val="111111"/>
           <w:sz w:val="24"/>
           <w:szCs w:val="24"/>
           <w:highlight w:val="none"/>
           <w:shd w:val="clear" w:fill="auto"/>
         </w:rPr>
-        <w:t xml:space="preserve">Date de dernière échéance </w:t>
+      </w:pPr>
+      <w:r>
+        <w:rPr>
+          <w:rFonts w:hint="default" w:ascii="Times New Roman" w:hAnsi="Times New Roman" w:cs="Times New Roman"/>
+          <w:b/>
+          <w:sz w:val="24"/>
+          <w:szCs w:val="24"/>
+          <w:lang w:val="en-US"/>
+        </w:rPr>
+        <w:tab/>
       </w:r>
       <w:r>
         <w:rPr>
@@ -1568,7 +1622,17 @@
           <w:color w:val="111111"/>
           <w:sz w:val="24"/>
           <w:szCs w:val="24"/>
-          <w:highlight w:val="none"/>
+          <w:shd w:val="clear" w:fill="auto"/>
+        </w:rPr>
+        <w:t>Date de la première échéance</w:t>
+      </w:r>
+      <w:r>
+        <w:rPr>
+          <w:rFonts w:hint="default" w:ascii="Times New Roman" w:hAnsi="Times New Roman" w:cs="Times New Roman"/>
+          <w:b/>
+          <w:color w:val="111111"/>
+          <w:sz w:val="24"/>
+          <w:szCs w:val="24"/>
           <w:shd w:val="clear" w:fill="auto"/>
           <w:lang w:val="en-US"/>
         </w:rPr>
@@ -1581,7 +1645,6 @@
           <w:color w:val="111111"/>
           <w:sz w:val="24"/>
           <w:szCs w:val="24"/>
-          <w:highlight w:val="none"/>
           <w:shd w:val="clear" w:fill="auto"/>
           <w:lang w:val="en-US"/>
         </w:rPr>
@@ -1594,43 +1657,13 @@
           <w:color w:val="111111"/>
           <w:sz w:val="24"/>
           <w:szCs w:val="24"/>
-          <w:highlight w:val="none"/>
-          <w:shd w:val="clear" w:fill="auto"/>
-          <w:lang w:val="en-US"/>
-        </w:rPr>
-        <w:tab/>
-      </w:r>
-      <w:r>
-        <w:rPr>
-          <w:rFonts w:hint="default" w:ascii="Times New Roman" w:hAnsi="Times New Roman" w:cs="Times New Roman"/>
-          <w:b/>
-          <w:color w:val="111111"/>
-          <w:sz w:val="24"/>
-          <w:szCs w:val="24"/>
-          <w:highlight w:val="none"/>
           <w:shd w:val="clear" w:fill="auto"/>
         </w:rPr>
         <w:t>:</w:t>
       </w:r>
-      <w:r>
-        <w:rPr>
-          <w:rFonts w:hint="default" w:ascii="Times New Roman" w:hAnsi="Times New Roman" w:cs="Times New Roman"/>
-          <w:b/>
-          <w:color w:val="FF0000"/>
-          <w:sz w:val="24"/>
-          <w:szCs w:val="24"/>
-          <w:highlight w:val="none"/>
-        </w:rPr>
-        <w:tab/>
-      </w:r>
-    </w:p>
-    <w:p>
-      <w:pPr>
-        <w:pStyle w:val="20"/>
-        <w:numPr>
-          <w:ilvl w:val="0"/>
-          <w:numId w:val="0"/>
-        </w:numPr>
+    </w:p>
+    <w:p>
+      <w:pPr>
         <w:tabs>
           <w:tab w:val="left" w:pos="708"/>
           <w:tab w:val="left" w:pos="1416"/>
@@ -1638,25 +1671,24 @@
           <w:tab w:val="left" w:pos="2748"/>
           <w:tab w:val="left" w:pos="3708"/>
         </w:tabs>
-        <w:spacing w:before="0" w:after="160" w:line="240" w:lineRule="auto"/>
-        <w:ind w:left="0" w:firstLine="0"/>
-        <w:contextualSpacing/>
-        <w:jc w:val="both"/>
-        <w:rPr>
-          <w:rFonts w:hint="default" w:ascii="Times New Roman" w:hAnsi="Times New Roman" w:cs="Times New Roman"/>
-          <w:b/>
-          <w:sz w:val="24"/>
-          <w:szCs w:val="24"/>
-          <w:highlight w:val="none"/>
-          <w:lang w:val="en-US"/>
-        </w:rPr>
-      </w:pPr>
-      <w:r>
-        <w:rPr>
-          <w:rFonts w:hint="default" w:ascii="Times New Roman" w:hAnsi="Times New Roman" w:cs="Times New Roman"/>
-          <w:b/>
-          <w:sz w:val="24"/>
-          <w:szCs w:val="24"/>
+        <w:spacing w:line="240" w:lineRule="auto"/>
+        <w:jc w:val="both"/>
+        <w:rPr>
+          <w:rFonts w:hint="default" w:ascii="Times New Roman" w:hAnsi="Times New Roman" w:cs="Times New Roman"/>
+          <w:b/>
+          <w:sz w:val="24"/>
+          <w:szCs w:val="24"/>
+          <w:highlight w:val="none"/>
+        </w:rPr>
+      </w:pPr>
+      <w:r>
+        <w:rPr>
+          <w:rFonts w:hint="default" w:ascii="Times New Roman" w:hAnsi="Times New Roman" w:cs="Times New Roman"/>
+          <w:b/>
+          <w:color w:val="111111"/>
+          <w:sz w:val="24"/>
+          <w:szCs w:val="24"/>
+          <w:shd w:val="clear" w:fill="auto"/>
           <w:lang w:val="en-US"/>
         </w:rPr>
         <w:tab/>
@@ -1665,11 +1697,47 @@
         <w:rPr>
           <w:rFonts w:hint="default" w:ascii="Times New Roman" w:hAnsi="Times New Roman" w:cs="Times New Roman"/>
           <w:b/>
-          <w:sz w:val="24"/>
-          <w:szCs w:val="24"/>
-          <w:lang w:val="en-US"/>
-        </w:rPr>
-        <w:t>${line_risk_premium_percentage}</w:t>
+          <w:color w:val="111111"/>
+          <w:sz w:val="24"/>
+          <w:szCs w:val="24"/>
+          <w:shd w:val="clear" w:fill="auto"/>
+        </w:rPr>
+        <w:t>Date de dernière échéance</w:t>
+      </w:r>
+      <w:r>
+        <w:rPr>
+          <w:rFonts w:hint="default" w:ascii="Times New Roman" w:hAnsi="Times New Roman" w:cs="Times New Roman"/>
+          <w:b/>
+          <w:color w:val="111111"/>
+          <w:sz w:val="24"/>
+          <w:szCs w:val="24"/>
+          <w:shd w:val="clear" w:fill="auto"/>
+          <w:lang w:val="en-US"/>
+        </w:rPr>
+        <w:tab/>
+      </w:r>
+      <w:r>
+        <w:rPr>
+          <w:rFonts w:hint="default" w:ascii="Times New Roman" w:hAnsi="Times New Roman" w:cs="Times New Roman"/>
+          <w:b/>
+          <w:color w:val="111111"/>
+          <w:sz w:val="24"/>
+          <w:szCs w:val="24"/>
+          <w:shd w:val="clear" w:fill="auto"/>
+          <w:lang w:val="en-US"/>
+        </w:rPr>
+        <w:tab/>
+      </w:r>
+      <w:r>
+        <w:rPr>
+          <w:rFonts w:hint="default" w:ascii="Times New Roman" w:hAnsi="Times New Roman" w:cs="Times New Roman"/>
+          <w:b/>
+          <w:color w:val="111111"/>
+          <w:sz w:val="24"/>
+          <w:szCs w:val="24"/>
+          <w:shd w:val="clear" w:fill="auto"/>
+        </w:rPr>
+        <w:t>:</w:t>
       </w:r>
     </w:p>
     <w:p>
@@ -1682,87 +1750,6 @@
           <w:tab w:val="left" w:pos="3708"/>
         </w:tabs>
         <w:spacing w:line="240" w:lineRule="auto"/>
-        <w:rPr>
-          <w:rFonts w:hint="default" w:ascii="Times New Roman" w:hAnsi="Times New Roman" w:cs="Times New Roman"/>
-          <w:b/>
-          <w:sz w:val="24"/>
-          <w:szCs w:val="24"/>
-        </w:rPr>
-      </w:pPr>
-      <w:r>
-        <w:rPr>
-          <w:rFonts w:hint="default" w:ascii="Times New Roman" w:hAnsi="Times New Roman" w:cs="Times New Roman"/>
-          <w:b/>
-          <w:sz w:val="24"/>
-          <w:szCs w:val="24"/>
-          <w:shd w:val="clear" w:fill="auto"/>
-          <w:lang w:val="en-US"/>
-        </w:rPr>
-        <w:tab/>
-      </w:r>
-      <w:r>
-        <w:rPr>
-          <w:rFonts w:hint="default" w:ascii="Times New Roman" w:hAnsi="Times New Roman" w:cs="Times New Roman"/>
-          <w:b/>
-          <w:sz w:val="24"/>
-          <w:szCs w:val="24"/>
-          <w:shd w:val="clear" w:fill="auto"/>
-          <w:lang w:val="en-US"/>
-        </w:rPr>
-        <w:t>${line_review_bonus}</w:t>
-      </w:r>
-    </w:p>
-    <w:p>
-      <w:pPr>
-        <w:tabs>
-          <w:tab w:val="left" w:pos="708"/>
-          <w:tab w:val="left" w:pos="1416"/>
-          <w:tab w:val="left" w:pos="2124"/>
-          <w:tab w:val="left" w:pos="2748"/>
-          <w:tab w:val="left" w:pos="3708"/>
-        </w:tabs>
-        <w:spacing w:line="240" w:lineRule="auto"/>
-        <w:ind w:left="720"/>
-        <w:rPr>
-          <w:rFonts w:hint="default" w:ascii="Times New Roman" w:hAnsi="Times New Roman" w:cs="Times New Roman"/>
-          <w:b/>
-          <w:color w:val="FF0000"/>
-          <w:sz w:val="24"/>
-          <w:szCs w:val="24"/>
-          <w:highlight w:val="none"/>
-        </w:rPr>
-      </w:pPr>
-    </w:p>
-    <w:p>
-      <w:pPr>
-        <w:tabs>
-          <w:tab w:val="left" w:pos="708"/>
-          <w:tab w:val="left" w:pos="1416"/>
-          <w:tab w:val="left" w:pos="2124"/>
-          <w:tab w:val="left" w:pos="2748"/>
-          <w:tab w:val="left" w:pos="3708"/>
-        </w:tabs>
-        <w:spacing w:line="240" w:lineRule="auto"/>
-        <w:jc w:val="both"/>
-        <w:rPr>
-          <w:rFonts w:hint="default" w:ascii="Times New Roman" w:hAnsi="Times New Roman" w:cs="Times New Roman"/>
-          <w:b/>
-          <w:sz w:val="24"/>
-          <w:szCs w:val="24"/>
-          <w:highlight w:val="none"/>
-        </w:rPr>
-      </w:pPr>
-    </w:p>
-    <w:p>
-      <w:pPr>
-        <w:tabs>
-          <w:tab w:val="left" w:pos="708"/>
-          <w:tab w:val="left" w:pos="1416"/>
-          <w:tab w:val="left" w:pos="2124"/>
-          <w:tab w:val="left" w:pos="2748"/>
-          <w:tab w:val="left" w:pos="3708"/>
-        </w:tabs>
-        <w:spacing w:line="240" w:lineRule="auto"/>
         <w:jc w:val="both"/>
         <w:rPr>
           <w:rFonts w:hint="default" w:ascii="Times New Roman" w:hAnsi="Times New Roman" w:cs="Times New Roman"/>
@@ -3022,8 +3009,6 @@
         </w:rPr>
         <w:t>${type_of_guarantee.name}</w:t>
       </w:r>
-      <w:bookmarkStart w:id="10" w:name="_GoBack"/>
-      <w:bookmarkEnd w:id="10"/>
       <w:r>
         <w:rPr>
           <w:rFonts w:hint="default" w:ascii="Times New Roman" w:hAnsi="Times New Roman" w:cs="Times New Roman"/>

</xml_diff>